<commit_message>
docs: fix Section 5 technology comparison
</commit_message>
<xml_diff>
--- a/docs/05-technology-comparison.docx
+++ b/docs/05-technology-comparison.docx
@@ -6,14 +6,8 @@
       <w:pPr>
         <w:pStyle w:val="1"/>
         <w:pageBreakBefore/>
-        <w:rPr>
-          <w:rFonts w:ascii="Times New Roman" w:hAnsi="Times New Roman" w:cs="Times New Roman"/>
-        </w:rPr>
       </w:pPr>
       <w:r>
-        <w:rPr>
-          <w:rFonts w:ascii="Times New Roman" w:hAnsi="Times New Roman" w:cs="Times New Roman"/>
-        </w:rPr>
         <w:t>5. Technology Comparison</w:t>
       </w:r>
     </w:p>
@@ -38,27 +32,17 @@
     <w:p>
       <w:pPr>
         <w:pStyle w:val="2"/>
-        <w:rPr>
-          <w:rFonts w:ascii="Times New Roman" w:hAnsi="Times New Roman" w:cs="Times New Roman"/>
-        </w:rPr>
       </w:pPr>
       <w:r>
-        <w:rPr>
-          <w:rFonts w:ascii="Times New Roman" w:hAnsi="Times New Roman" w:cs="Times New Roman"/>
-        </w:rPr>
         <w:t xml:space="preserve">5.1 Decision 1 </w:t>
       </w:r>
       <w:r>
         <w:rPr>
-          <w:rFonts w:ascii="Times New Roman" w:hAnsi="Times New Roman" w:cs="Times New Roman"/>
           <w:lang w:val="en-US"/>
         </w:rPr>
         <w:t>-</w:t>
       </w:r>
       <w:r>
-        <w:rPr>
-          <w:rFonts w:ascii="Times New Roman" w:hAnsi="Times New Roman" w:cs="Times New Roman"/>
-        </w:rPr>
         <w:t xml:space="preserve"> Backend platform</w:t>
       </w:r>
     </w:p>
@@ -1039,27 +1023,17 @@
     <w:p>
       <w:pPr>
         <w:pStyle w:val="2"/>
-        <w:rPr>
-          <w:rFonts w:ascii="Times New Roman" w:hAnsi="Times New Roman" w:cs="Times New Roman"/>
-        </w:rPr>
       </w:pPr>
       <w:r>
-        <w:rPr>
-          <w:rFonts w:ascii="Times New Roman" w:hAnsi="Times New Roman" w:cs="Times New Roman"/>
-        </w:rPr>
         <w:t xml:space="preserve">5.2 Decision 2 </w:t>
       </w:r>
       <w:r>
         <w:rPr>
-          <w:rFonts w:ascii="Times New Roman" w:hAnsi="Times New Roman" w:cs="Times New Roman"/>
           <w:lang w:val="en-US"/>
         </w:rPr>
         <w:t>-</w:t>
       </w:r>
       <w:r>
-        <w:rPr>
-          <w:rFonts w:ascii="Times New Roman" w:hAnsi="Times New Roman" w:cs="Times New Roman"/>
-        </w:rPr>
         <w:t xml:space="preserve"> Data storage and vector search</w:t>
       </w:r>
     </w:p>
@@ -2001,34 +1975,23 @@
         <w:jc w:val="both"/>
       </w:pPr>
       <w:r>
-        <w:lastRenderedPageBreak/>
         <w:t>Decision: PostgreSQL with pgvector. A single transactional store supports synthetic patient profiles, clinic and doctor records, slots, bookings, versioned drug rules, alerts and append-only audit logs. The team generates synthetic data using its own seeded scripts; the product has no Synthea/FHIR import feature.</w:t>
       </w:r>
     </w:p>
     <w:p>
       <w:pPr>
         <w:pStyle w:val="2"/>
-        <w:rPr>
-          <w:rFonts w:ascii="Times New Roman" w:hAnsi="Times New Roman" w:cs="Times New Roman"/>
-        </w:rPr>
       </w:pPr>
       <w:r>
-        <w:rPr>
-          <w:rFonts w:ascii="Times New Roman" w:hAnsi="Times New Roman" w:cs="Times New Roman"/>
-        </w:rPr>
         <w:t xml:space="preserve">5.3 Decision 3 </w:t>
       </w:r>
       <w:r>
         <w:rPr>
-          <w:rFonts w:ascii="Times New Roman" w:hAnsi="Times New Roman" w:cs="Times New Roman"/>
           <w:lang w:val="en-US"/>
         </w:rPr>
         <w:t>-</w:t>
       </w:r>
       <w:r>
-        <w:rPr>
-          <w:rFonts w:ascii="Times New Roman" w:hAnsi="Times New Roman" w:cs="Times New Roman"/>
-        </w:rPr>
         <w:t xml:space="preserve"> Source of drug-interaction knowledge (“own knowledge base”)</w:t>
       </w:r>
     </w:p>
@@ -3074,27 +3037,18 @@
     <w:p>
       <w:pPr>
         <w:pStyle w:val="2"/>
-        <w:rPr>
-          <w:rFonts w:ascii="Times New Roman" w:hAnsi="Times New Roman" w:cs="Times New Roman"/>
-        </w:rPr>
       </w:pPr>
       <w:r>
-        <w:rPr>
-          <w:rFonts w:ascii="Times New Roman" w:hAnsi="Times New Roman" w:cs="Times New Roman"/>
-        </w:rPr>
+        <w:lastRenderedPageBreak/>
         <w:t xml:space="preserve">5.4 Decision 4 </w:t>
       </w:r>
       <w:r>
         <w:rPr>
-          <w:rFonts w:ascii="Times New Roman" w:hAnsi="Times New Roman" w:cs="Times New Roman"/>
           <w:lang w:val="en-US"/>
         </w:rPr>
         <w:t>-</w:t>
       </w:r>
       <w:r>
-        <w:rPr>
-          <w:rFonts w:ascii="Times New Roman" w:hAnsi="Times New Roman" w:cs="Times New Roman"/>
-        </w:rPr>
         <w:t xml:space="preserve"> Language model for extraction and explanation</w:t>
       </w:r>
     </w:p>
@@ -3449,7 +3403,6 @@
                 <w:sz w:val="19"/>
                 <w:szCs w:val="19"/>
               </w:rPr>
-              <w:lastRenderedPageBreak/>
               <w:t>Data privacy (no patient text leaves the server) (NFR-08)</w:t>
             </w:r>
           </w:p>
@@ -3586,7 +3539,7 @@
                 <w:sz w:val="19"/>
                 <w:szCs w:val="19"/>
               </w:rPr>
-              <w:t>Cost and reproducibility of experiments (NFR-08)</w:t>
+              <w:t>Cost and reproducibility of experiments (NFR-17)</w:t>
             </w:r>
           </w:p>
         </w:tc>
@@ -4015,27 +3968,17 @@
     <w:p>
       <w:pPr>
         <w:pStyle w:val="2"/>
-        <w:rPr>
-          <w:rFonts w:ascii="Times New Roman" w:hAnsi="Times New Roman" w:cs="Times New Roman"/>
-        </w:rPr>
       </w:pPr>
       <w:r>
-        <w:rPr>
-          <w:rFonts w:ascii="Times New Roman" w:hAnsi="Times New Roman" w:cs="Times New Roman"/>
-        </w:rPr>
         <w:t xml:space="preserve">5.5 Decision 5 </w:t>
       </w:r>
       <w:r>
         <w:rPr>
-          <w:rFonts w:ascii="Times New Roman" w:hAnsi="Times New Roman" w:cs="Times New Roman"/>
           <w:lang w:val="ru-RU"/>
         </w:rPr>
         <w:t>-</w:t>
       </w:r>
       <w:r>
-        <w:rPr>
-          <w:rFonts w:ascii="Times New Roman" w:hAnsi="Times New Roman" w:cs="Times New Roman"/>
-        </w:rPr>
         <w:t xml:space="preserve"> Frontend</w:t>
       </w:r>
     </w:p>
@@ -4360,7 +4303,7 @@
                 <w:sz w:val="19"/>
                 <w:szCs w:val="19"/>
               </w:rPr>
-              <w:t>Desktop web interfaces for all three roles (FR-36)</w:t>
+              <w:t>Desktop web interfaces for all three roles (FR-01, FR-46; NFR-14)</w:t>
             </w:r>
           </w:p>
         </w:tc>
@@ -4709,33 +4652,24 @@
         <w:jc w:val="both"/>
       </w:pPr>
       <w:r>
-        <w:t>Decision: React + Next.js with TypeScript. A shared desktop web application provides the Doctor workspace, Patient Web Interface and Administrator Dashboard. Telegram Bot API supports reminders and patient chatbot flows; no mobile app or PWA is planned.</w:t>
+        <w:t>Decision: React + Next.js with TypeScript. A shared desktop web application provides the Doctor workspace, Patient Web Interface and Administrator Dashboard. Telegram Bot API supports reminders and patient chatbot flows; the product targets desktop web workflows.</w:t>
       </w:r>
     </w:p>
     <w:p>
       <w:pPr>
         <w:pStyle w:val="2"/>
-        <w:rPr>
-          <w:rFonts w:ascii="Times New Roman" w:hAnsi="Times New Roman" w:cs="Times New Roman"/>
-        </w:rPr>
       </w:pPr>
       <w:r>
-        <w:rPr>
-          <w:rFonts w:ascii="Times New Roman" w:hAnsi="Times New Roman" w:cs="Times New Roman"/>
-        </w:rPr>
+        <w:lastRenderedPageBreak/>
         <w:t xml:space="preserve">5.6 Decision 6 </w:t>
       </w:r>
       <w:r>
         <w:rPr>
-          <w:rFonts w:ascii="Times New Roman" w:hAnsi="Times New Roman" w:cs="Times New Roman"/>
           <w:lang w:val="en-US"/>
         </w:rPr>
         <w:t>-</w:t>
       </w:r>
       <w:r>
-        <w:rPr>
-          <w:rFonts w:ascii="Times New Roman" w:hAnsi="Times New Roman" w:cs="Times New Roman"/>
-        </w:rPr>
         <w:t xml:space="preserve"> Component interaction and background jobs</w:t>
       </w:r>
     </w:p>
@@ -5090,7 +5024,7 @@
                 <w:sz w:val="19"/>
                 <w:szCs w:val="19"/>
               </w:rPr>
-              <w:t>Long jobs: offline data preparation and evaluation (FR-36, FR-17)</w:t>
+              <w:t>Long jobs: offline data preparation and evaluation (NFR-21, NFR-17)</w:t>
             </w:r>
           </w:p>
         </w:tc>
@@ -5211,7 +5145,6 @@
                 <w:sz w:val="19"/>
                 <w:szCs w:val="19"/>
               </w:rPr>
-              <w:lastRenderedPageBreak/>
               <w:t>Complexity for a 3-person team</w:t>
             </w:r>
           </w:p>

</xml_diff>